<commit_message>
Actualización a OneDrive y mejoras de texto
</commit_message>
<xml_diff>
--- a/plantilla/fueradeservicio.docx
+++ b/plantilla/fueradeservicio.docx
@@ -156,49 +156,21 @@
         <w:rPr>
           <w:color w:val="000000"/>
         </w:rPr>
-        <w:t xml:space="preserve">Contacto: </w:t>
-      </w:r>
-      <w:proofErr w:type="gramStart"/>
-      <w:r>
-        <w:rPr>
-          <w:color w:val="000000"/>
-        </w:rPr>
-        <w:t xml:space="preserve">{{ </w:t>
+        <w:t xml:space="preserve">Contacto: {{ </w:t>
       </w:r>
       <w:proofErr w:type="spellStart"/>
       <w:r>
         <w:rPr>
           <w:color w:val="000000"/>
         </w:rPr>
-        <w:t>cliente</w:t>
-      </w:r>
-      <w:proofErr w:type="gramEnd"/>
-      <w:r>
-        <w:rPr>
-          <w:color w:val="000000"/>
-        </w:rPr>
-        <w:t>_</w:t>
-      </w:r>
-      <w:proofErr w:type="gramStart"/>
-      <w:r>
-        <w:rPr>
-          <w:color w:val="000000"/>
-        </w:rPr>
-        <w:t>contacto</w:t>
+        <w:t>cliente_contacto</w:t>
       </w:r>
       <w:proofErr w:type="spellEnd"/>
       <w:r>
         <w:rPr>
           <w:color w:val="000000"/>
         </w:rPr>
-        <w:t xml:space="preserve"> }</w:t>
-      </w:r>
-      <w:proofErr w:type="gramEnd"/>
-      <w:r>
-        <w:rPr>
-          <w:color w:val="000000"/>
-        </w:rPr>
-        <w:t>}</w:t>
+        <w:t xml:space="preserve"> }}</w:t>
       </w:r>
     </w:p>
     <w:p>
@@ -278,7 +250,7 @@
               </wp:anchor>
             </w:drawing>
           </mc:Choice>
-          <mc:Fallback xmlns:cr="http://schemas.microsoft.com/office/comments/2020/reactions" xmlns="http://schemas.microsoft.com/office/tasks/2019/documenttasks" xmlns:dgm="http://schemas.openxmlformats.org/drawingml/2006/diagram" xmlns:lc="http://schemas.openxmlformats.org/drawingml/2006/lockedCanvas" xmlns:c="http://schemas.openxmlformats.org/drawingml/2006/chart" xmlns:pic="http://schemas.openxmlformats.org/drawingml/2006/picture" xmlns:a="http://schemas.openxmlformats.org/drawingml/2006/main" xmlns:sl="http://schemas.openxmlformats.org/schemaLibrary/2006/main">
+          <mc:Fallback xmlns:sl="http://schemas.openxmlformats.org/schemaLibrary/2006/main" xmlns:a="http://schemas.openxmlformats.org/drawingml/2006/main" xmlns:pic="http://schemas.openxmlformats.org/drawingml/2006/picture" xmlns:c="http://schemas.openxmlformats.org/drawingml/2006/chart" xmlns:lc="http://schemas.openxmlformats.org/drawingml/2006/lockedCanvas" xmlns:dgm="http://schemas.openxmlformats.org/drawingml/2006/diagram" xmlns="http://schemas.microsoft.com/office/tasks/2019/documenttasks" xmlns:cr="http://schemas.microsoft.com/office/comments/2020/reactions">
             <w:drawing>
               <wp:anchor allowOverlap="1" behindDoc="0" distB="0" distT="0" distL="0" distR="0" hidden="0" layoutInCell="1" locked="0" relativeHeight="0" simplePos="0">
                 <wp:simplePos x="0" y="0"/>
@@ -345,71 +317,29 @@
         <w:ind w:left="152"/>
       </w:pPr>
       <w:r>
-        <w:t xml:space="preserve">Se realizó </w:t>
-      </w:r>
-      <w:proofErr w:type="gramStart"/>
-      <w:r>
-        <w:t xml:space="preserve">{{ </w:t>
+        <w:t xml:space="preserve">Se realizó {{ </w:t>
       </w:r>
       <w:proofErr w:type="spellStart"/>
       <w:r>
-        <w:t>tipo</w:t>
-      </w:r>
-      <w:proofErr w:type="gramEnd"/>
-      <w:r>
-        <w:t>_</w:t>
-      </w:r>
-      <w:proofErr w:type="gramStart"/>
-      <w:r>
-        <w:t>intervencion</w:t>
+        <w:t>tipo_intervencion</w:t>
       </w:r>
       <w:proofErr w:type="spellEnd"/>
       <w:r>
-        <w:t xml:space="preserve"> }</w:t>
-      </w:r>
-      <w:proofErr w:type="gramEnd"/>
-      <w:r>
-        <w:t xml:space="preserve">} a equipo compresor </w:t>
-      </w:r>
-      <w:proofErr w:type="gramStart"/>
-      <w:r>
-        <w:t>{{ modelo</w:t>
-      </w:r>
-      <w:proofErr w:type="gramEnd"/>
-      <w:r>
-        <w:t xml:space="preserve"> }} con TAG identificador </w:t>
-      </w:r>
-      <w:proofErr w:type="gramStart"/>
-      <w:r>
-        <w:t>{{ tag</w:t>
-      </w:r>
-      <w:proofErr w:type="gramEnd"/>
-      <w:r>
-        <w:t xml:space="preserve"> }} de </w:t>
-      </w:r>
-      <w:proofErr w:type="gramStart"/>
-      <w:r>
-        <w:t xml:space="preserve">{{ </w:t>
+        <w:t xml:space="preserve"> }} a equipo compresor {{ modelo }} con TAG identificador {{ tag }} de {{ </w:t>
       </w:r>
       <w:proofErr w:type="spellStart"/>
       <w:r>
         <w:t>ubicacion</w:t>
       </w:r>
       <w:proofErr w:type="spellEnd"/>
-      <w:proofErr w:type="gramEnd"/>
-      <w:r>
-        <w:t xml:space="preserve"> }}, </w:t>
-      </w:r>
-      <w:proofErr w:type="gramStart"/>
-      <w:r>
-        <w:t xml:space="preserve">{{ </w:t>
+      <w:r>
+        <w:t xml:space="preserve"> }}, {{ </w:t>
       </w:r>
       <w:proofErr w:type="spellStart"/>
       <w:r>
         <w:t>area</w:t>
       </w:r>
       <w:proofErr w:type="spellEnd"/>
-      <w:proofErr w:type="gramEnd"/>
       <w:r>
         <w:t xml:space="preserve"> }}, conforme a procedimientos internos y buenas prácticas de mantenimiento.</w:t>
       </w:r>
@@ -497,11 +427,17 @@
           <w:between w:val="nil"/>
         </w:pBdr>
         <w:spacing w:before="198"/>
-        <w:rPr>
-          <w:color w:val="000000"/>
-        </w:rPr>
-      </w:pPr>
-      <w:proofErr w:type="gramStart"/>
+        <w:ind w:firstLine="304"/>
+        <w:rPr>
+          <w:color w:val="000000"/>
+        </w:rPr>
+      </w:pPr>
+      <w:r>
+        <w:rPr>
+          <w:color w:val="000000"/>
+        </w:rPr>
+        <w:t xml:space="preserve"> </w:t>
+      </w:r>
       <w:r>
         <w:rPr>
           <w:color w:val="000000"/>
@@ -513,35 +449,14 @@
         <w:rPr>
           <w:color w:val="000000"/>
         </w:rPr>
-        <w:t>estado</w:t>
-      </w:r>
-      <w:proofErr w:type="gramEnd"/>
-      <w:r>
-        <w:rPr>
-          <w:color w:val="000000"/>
-        </w:rPr>
-        <w:t>_</w:t>
-      </w:r>
-      <w:proofErr w:type="gramStart"/>
-      <w:r>
-        <w:rPr>
-          <w:color w:val="000000"/>
-        </w:rPr>
-        <w:t>entrega</w:t>
+        <w:t>estado_entrega</w:t>
       </w:r>
       <w:proofErr w:type="spellEnd"/>
       <w:r>
         <w:rPr>
           <w:color w:val="000000"/>
         </w:rPr>
-        <w:t xml:space="preserve"> }</w:t>
-      </w:r>
-      <w:proofErr w:type="gramEnd"/>
-      <w:r>
-        <w:rPr>
-          <w:color w:val="000000"/>
-        </w:rPr>
-        <w:t>}</w:t>
+        <w:t xml:space="preserve"> }}</w:t>
       </w:r>
     </w:p>
     <w:p>
@@ -2810,7 +2725,7 @@
               </wp:anchor>
             </w:drawing>
           </mc:Choice>
-          <mc:Fallback xmlns:cr="http://schemas.microsoft.com/office/comments/2020/reactions" xmlns="http://schemas.microsoft.com/office/tasks/2019/documenttasks" xmlns:dgm="http://schemas.openxmlformats.org/drawingml/2006/diagram" xmlns:lc="http://schemas.openxmlformats.org/drawingml/2006/lockedCanvas" xmlns:c="http://schemas.openxmlformats.org/drawingml/2006/chart" xmlns:pic="http://schemas.openxmlformats.org/drawingml/2006/picture" xmlns:a="http://schemas.openxmlformats.org/drawingml/2006/main" xmlns:sl="http://schemas.openxmlformats.org/schemaLibrary/2006/main">
+          <mc:Fallback xmlns:sl="http://schemas.openxmlformats.org/schemaLibrary/2006/main" xmlns:a="http://schemas.openxmlformats.org/drawingml/2006/main" xmlns:pic="http://schemas.openxmlformats.org/drawingml/2006/picture" xmlns:c="http://schemas.openxmlformats.org/drawingml/2006/chart" xmlns:lc="http://schemas.openxmlformats.org/drawingml/2006/lockedCanvas" xmlns:dgm="http://schemas.openxmlformats.org/drawingml/2006/diagram" xmlns="http://schemas.microsoft.com/office/tasks/2019/documenttasks" xmlns:cr="http://schemas.microsoft.com/office/comments/2020/reactions">
             <w:drawing>
               <wp:anchor allowOverlap="1" behindDoc="0" distB="0" distT="0" distL="0" distR="0" hidden="0" layoutInCell="1" locked="0" relativeHeight="0" simplePos="0">
                 <wp:simplePos x="0" y="0"/>

</xml_diff>